<commit_message>
Simplify implementation rationale formatting
</commit_message>
<xml_diff>
--- a/Gowtham_Revanur_Implementation.docx
+++ b/Gowtham_Revanur_Implementation.docx
@@ -22,121 +22,62 @@
         <w:t>CSC 6370 Mobile Application Development  |  Homework 1</w:t>
       </w:r>
     </w:p>
-    <w:tbl>
-      <w:tblPr>
-        <w:tblStyle w:val="TableGrid"/>
-        <w:tblW w:type="auto" w:w="0"/>
-        <w:tblLook w:firstColumn="1" w:firstRow="1" w:lastColumn="0" w:lastRow="0" w:noHBand="0" w:noVBand="1" w:val="04A0"/>
-      </w:tblPr>
-      <w:tblGrid>
-        <w:gridCol w:w="4968"/>
-        <w:gridCol w:w="4968"/>
-      </w:tblGrid>
-      <w:tr>
-        <w:tc>
-          <w:tcPr>
-            <w:tcW w:type="dxa" w:w="4968"/>
-            <w:tcMar>
-              <w:top w:w="100" w:type="dxa"/>
-              <w:start w:w="120" w:type="dxa"/>
-              <w:bottom w:w="100" w:type="dxa"/>
-              <w:end w:w="120" w:type="dxa"/>
-            </w:tcMar>
-            <w:shd w:fill="F2F5FA"/>
-          </w:tcPr>
-          <w:p>
-            <w:r/>
-            <w:r>
-              <w:rPr>
-                <w:b/>
-              </w:rPr>
-              <w:t>Student</w:t>
-              <w:br/>
-            </w:r>
-            <w:r>
-              <w:t>Gowtham Revanur</w:t>
-            </w:r>
-          </w:p>
-        </w:tc>
-        <w:tc>
-          <w:tcPr>
-            <w:tcW w:type="dxa" w:w="4968"/>
-            <w:tcMar>
-              <w:top w:w="100" w:type="dxa"/>
-              <w:start w:w="120" w:type="dxa"/>
-              <w:bottom w:w="100" w:type="dxa"/>
-              <w:end w:w="120" w:type="dxa"/>
-            </w:tcMar>
-            <w:shd w:fill="F2F5FA"/>
-          </w:tcPr>
-          <w:p>
-            <w:r/>
-            <w:r>
-              <w:rPr>
-                <w:b/>
-              </w:rPr>
-              <w:t>Student ID</w:t>
-              <w:br/>
-            </w:r>
-            <w:r>
-              <w:t>002574540</w:t>
-            </w:r>
-          </w:p>
-        </w:tc>
-      </w:tr>
-      <w:tr>
-        <w:tc>
-          <w:tcPr>
-            <w:tcW w:type="dxa" w:w="4968"/>
-            <w:tcMar>
-              <w:top w:w="100" w:type="dxa"/>
-              <w:start w:w="120" w:type="dxa"/>
-              <w:bottom w:w="100" w:type="dxa"/>
-              <w:end w:w="120" w:type="dxa"/>
-            </w:tcMar>
-            <w:shd w:fill="F2F5FA"/>
-          </w:tcPr>
-          <w:p>
-            <w:r/>
-            <w:r>
-              <w:rPr>
-                <w:b/>
-              </w:rPr>
-              <w:t>Repository</w:t>
-              <w:br/>
-            </w:r>
-            <w:r>
-              <w:t>https://github.com/Grevanur/HW1</w:t>
-            </w:r>
-          </w:p>
-        </w:tc>
-        <w:tc>
-          <w:tcPr>
-            <w:tcW w:type="dxa" w:w="4968"/>
-            <w:tcMar>
-              <w:top w:w="100" w:type="dxa"/>
-              <w:start w:w="120" w:type="dxa"/>
-              <w:bottom w:w="100" w:type="dxa"/>
-              <w:end w:w="120" w:type="dxa"/>
-            </w:tcMar>
-            <w:shd w:fill="F2F5FA"/>
-          </w:tcPr>
-          <w:p>
-            <w:r/>
-            <w:r>
-              <w:rPr>
-                <w:b/>
-              </w:rPr>
-              <w:t>Date</w:t>
-              <w:br/>
-            </w:r>
-            <w:r>
-              <w:t>October 7, 2026</w:t>
-            </w:r>
-          </w:p>
-        </w:tc>
-      </w:tr>
-    </w:tbl>
+    <w:p>
+      <w:pPr>
+        <w:spacing w:after="20"/>
+      </w:pPr>
+      <w:r>
+        <w:rPr>
+          <w:b/>
+        </w:rPr>
+        <w:t xml:space="preserve">Student: </w:t>
+      </w:r>
+      <w:r>
+        <w:t>Gowtham Revanur</w:t>
+      </w:r>
+    </w:p>
+    <w:p>
+      <w:pPr>
+        <w:spacing w:after="20"/>
+      </w:pPr>
+      <w:r>
+        <w:rPr>
+          <w:b/>
+        </w:rPr>
+        <w:t xml:space="preserve">Student ID: </w:t>
+      </w:r>
+      <w:r>
+        <w:t>002574540</w:t>
+      </w:r>
+    </w:p>
+    <w:p>
+      <w:pPr>
+        <w:spacing w:after="20"/>
+      </w:pPr>
+      <w:r>
+        <w:rPr>
+          <w:b/>
+        </w:rPr>
+        <w:t xml:space="preserve">Repository: </w:t>
+      </w:r>
+      <w:r>
+        <w:t>https://github.com/Grevanur/HW1</w:t>
+      </w:r>
+    </w:p>
+    <w:p>
+      <w:pPr>
+        <w:spacing w:after="20"/>
+      </w:pPr>
+      <w:r>
+        <w:rPr>
+          <w:b/>
+        </w:rPr>
+        <w:t xml:space="preserve">Date: </w:t>
+      </w:r>
+      <w:r>
+        <w:t>October 7, 2026</w:t>
+      </w:r>
+    </w:p>
     <w:p>
       <w:pPr>
         <w:pStyle w:val="Heading1"/>
@@ -166,283 +107,86 @@
         <w:t>Selected Graduate Features and Evidence</w:t>
       </w:r>
     </w:p>
-    <w:tbl>
-      <w:tblPr>
-        <w:tblStyle w:val="TableGrid"/>
-        <w:tblW w:type="auto" w:w="0"/>
-        <w:tblLook w:firstColumn="1" w:firstRow="1" w:lastColumn="0" w:lastRow="0" w:noHBand="0" w:noVBand="1" w:val="04A0"/>
-      </w:tblPr>
-      <w:tblGrid>
-        <w:gridCol w:w="3312"/>
-        <w:gridCol w:w="3312"/>
-        <w:gridCol w:w="3312"/>
-      </w:tblGrid>
-      <w:tr>
-        <w:tc>
-          <w:tcPr>
-            <w:tcW w:type="dxa" w:w="3312"/>
-            <w:shd w:fill="1F4E78"/>
-            <w:tcMar>
-              <w:top w:w="100" w:type="dxa"/>
-              <w:start w:w="120" w:type="dxa"/>
-              <w:bottom w:w="100" w:type="dxa"/>
-              <w:end w:w="120" w:type="dxa"/>
-            </w:tcMar>
-          </w:tcPr>
-          <w:p>
-            <w:r>
-              <w:rPr>
-                <w:b/>
-                <w:color w:val="FFFFFF"/>
-              </w:rPr>
-              <w:t>Requirement</w:t>
-            </w:r>
-          </w:p>
-        </w:tc>
-        <w:tc>
-          <w:tcPr>
-            <w:tcW w:type="dxa" w:w="3312"/>
-            <w:shd w:fill="1F4E78"/>
-            <w:tcMar>
-              <w:top w:w="100" w:type="dxa"/>
-              <w:start w:w="120" w:type="dxa"/>
-              <w:bottom w:w="100" w:type="dxa"/>
-              <w:end w:w="120" w:type="dxa"/>
-            </w:tcMar>
-          </w:tcPr>
-          <w:p>
-            <w:r>
-              <w:rPr>
-                <w:b/>
-                <w:color w:val="FFFFFF"/>
-              </w:rPr>
-              <w:t>Implementation evidence</w:t>
-            </w:r>
-          </w:p>
-        </w:tc>
-        <w:tc>
-          <w:tcPr>
-            <w:tcW w:type="dxa" w:w="3312"/>
-            <w:shd w:fill="1F4E78"/>
-            <w:tcMar>
-              <w:top w:w="100" w:type="dxa"/>
-              <w:start w:w="120" w:type="dxa"/>
-              <w:bottom w:w="100" w:type="dxa"/>
-              <w:end w:w="120" w:type="dxa"/>
-            </w:tcMar>
-          </w:tcPr>
-          <w:p>
-            <w:r>
-              <w:rPr>
-                <w:b/>
-                <w:color w:val="FFFFFF"/>
-              </w:rPr>
-              <w:t>Verification evidence</w:t>
-            </w:r>
-          </w:p>
-        </w:tc>
-      </w:tr>
-      <w:tr>
-        <w:tc>
-          <w:tcPr>
-            <w:tcW w:type="dxa" w:w="3312"/>
-            <w:tcMar>
-              <w:top w:w="100" w:type="dxa"/>
-              <w:start w:w="120" w:type="dxa"/>
-              <w:bottom w:w="100" w:type="dxa"/>
-              <w:end w:w="120" w:type="dxa"/>
-            </w:tcMar>
-          </w:tcPr>
-          <w:p>
-            <w:r>
-              <w:t>Decimal support</w:t>
-            </w:r>
-          </w:p>
-        </w:tc>
-        <w:tc>
-          <w:tcPr>
-            <w:tcW w:type="dxa" w:w="3312"/>
-            <w:tcMar>
-              <w:top w:w="100" w:type="dxa"/>
-              <w:start w:w="120" w:type="dxa"/>
-              <w:bottom w:w="100" w:type="dxa"/>
-              <w:end w:w="120" w:type="dxa"/>
-            </w:tcMar>
-          </w:tcPr>
-          <w:p>
-            <w:r>
-              <w:t>The decimal key appends one point only when the display has none; decimal values flow through all four operations.</w:t>
-            </w:r>
-          </w:p>
-        </w:tc>
-        <w:tc>
-          <w:tcPr>
-            <w:tcW w:type="dxa" w:w="3312"/>
-            <w:tcMar>
-              <w:top w:w="100" w:type="dxa"/>
-              <w:start w:w="120" w:type="dxa"/>
-              <w:bottom w:w="100" w:type="dxa"/>
-              <w:end w:w="120" w:type="dxa"/>
-            </w:tcMar>
-          </w:tcPr>
-          <w:p>
-            <w:r>
-              <w:t>Automated tests cover decimal addition, subtraction, multiplication, and division.</w:t>
-            </w:r>
-          </w:p>
-        </w:tc>
-      </w:tr>
-      <w:tr>
-        <w:tc>
-          <w:tcPr>
-            <w:tcW w:type="dxa" w:w="3312"/>
-            <w:tcMar>
-              <w:top w:w="100" w:type="dxa"/>
-              <w:start w:w="120" w:type="dxa"/>
-              <w:bottom w:w="100" w:type="dxa"/>
-              <w:end w:w="120" w:type="dxa"/>
-            </w:tcMar>
-          </w:tcPr>
-          <w:p>
-            <w:r>
-              <w:t>Calculation history</w:t>
-            </w:r>
-          </w:p>
-        </w:tc>
-        <w:tc>
-          <w:tcPr>
-            <w:tcW w:type="dxa" w:w="3312"/>
-            <w:tcMar>
-              <w:top w:w="100" w:type="dxa"/>
-              <w:start w:w="120" w:type="dxa"/>
-              <w:bottom w:w="100" w:type="dxa"/>
-              <w:end w:w="120" w:type="dxa"/>
-            </w:tcMar>
-          </w:tcPr>
-          <w:p>
-            <w:r>
-              <w:t>Each completed operation is stored as a Calculation record. A scrollable list displays expression and result; tapping an entry reuses its result. The app bar clears history.</w:t>
-            </w:r>
-          </w:p>
-        </w:tc>
-        <w:tc>
-          <w:tcPr>
-            <w:tcW w:type="dxa" w:w="3312"/>
-            <w:tcMar>
-              <w:top w:w="100" w:type="dxa"/>
-              <w:start w:w="120" w:type="dxa"/>
-              <w:bottom w:w="100" w:type="dxa"/>
-              <w:end w:w="120" w:type="dxa"/>
-            </w:tcMar>
-          </w:tcPr>
-          <w:p>
-            <w:r>
-              <w:t>Manual test: complete 1.5 + 2.25 = 3.75, tap 3.75 in history, then continue a new calculation.</w:t>
-            </w:r>
-          </w:p>
-        </w:tc>
-      </w:tr>
-      <w:tr>
-        <w:tc>
-          <w:tcPr>
-            <w:tcW w:type="dxa" w:w="3312"/>
-            <w:tcMar>
-              <w:top w:w="100" w:type="dxa"/>
-              <w:start w:w="120" w:type="dxa"/>
-              <w:bottom w:w="100" w:type="dxa"/>
-              <w:end w:w="120" w:type="dxa"/>
-            </w:tcMar>
-          </w:tcPr>
-          <w:p>
-            <w:r>
-              <w:t>Multiple operations</w:t>
-            </w:r>
-          </w:p>
-        </w:tc>
-        <w:tc>
-          <w:tcPr>
-            <w:tcW w:type="dxa" w:w="3312"/>
-            <w:tcMar>
-              <w:top w:w="100" w:type="dxa"/>
-              <w:start w:w="120" w:type="dxa"/>
-              <w:bottom w:w="100" w:type="dxa"/>
-              <w:end w:w="120" w:type="dxa"/>
-            </w:tcMar>
-          </w:tcPr>
-          <w:p>
-            <w:r>
-              <w:t>When another operator is selected, the pending operation is completed and saved before the new operator is stored. The status line announces the running total.</w:t>
-            </w:r>
-          </w:p>
-        </w:tc>
-        <w:tc>
-          <w:tcPr>
-            <w:tcW w:type="dxa" w:w="3312"/>
-            <w:tcMar>
-              <w:top w:w="100" w:type="dxa"/>
-              <w:start w:w="120" w:type="dxa"/>
-              <w:bottom w:w="100" w:type="dxa"/>
-              <w:end w:w="120" w:type="dxa"/>
-            </w:tcMar>
-          </w:tcPr>
-          <w:p>
-            <w:r>
-              <w:t>Manual test: 8 + 2 × 3 produces 30 using documented left-to-right evaluation.</w:t>
-            </w:r>
-          </w:p>
-        </w:tc>
-      </w:tr>
-      <w:tr>
-        <w:tc>
-          <w:tcPr>
-            <w:tcW w:type="dxa" w:w="3312"/>
-            <w:tcMar>
-              <w:top w:w="100" w:type="dxa"/>
-              <w:start w:w="120" w:type="dxa"/>
-              <w:bottom w:w="100" w:type="dxa"/>
-              <w:end w:w="120" w:type="dxa"/>
-            </w:tcMar>
-          </w:tcPr>
-          <w:p>
-            <w:r>
-              <w:t>Advanced error handling</w:t>
-            </w:r>
-          </w:p>
-        </w:tc>
-        <w:tc>
-          <w:tcPr>
-            <w:tcW w:type="dxa" w:w="3312"/>
-            <w:tcMar>
-              <w:top w:w="100" w:type="dxa"/>
-              <w:start w:w="120" w:type="dxa"/>
-              <w:bottom w:w="100" w:type="dxa"/>
-              <w:end w:w="120" w:type="dxa"/>
-            </w:tcMar>
-          </w:tcPr>
-          <w:p>
-            <w:r>
-              <w:t>The app gives recoverable messages for incomplete expressions, division by zero, and non-finite or excessively large results. AC restores a known-good state.</w:t>
-            </w:r>
-          </w:p>
-        </w:tc>
-        <w:tc>
-          <w:tcPr>
-            <w:tcW w:type="dxa" w:w="3312"/>
-            <w:tcMar>
-              <w:top w:w="100" w:type="dxa"/>
-              <w:start w:w="120" w:type="dxa"/>
-              <w:bottom w:w="100" w:type="dxa"/>
-              <w:end w:w="120" w:type="dxa"/>
-            </w:tcMar>
-          </w:tcPr>
-          <w:p>
-            <w:r>
-              <w:t>Automated test rejects division by zero; manual checks exercise incomplete input and recovery with AC.</w:t>
-            </w:r>
-          </w:p>
-        </w:tc>
-      </w:tr>
-    </w:tbl>
+    <w:p>
+      <w:pPr>
+        <w:pStyle w:val="Heading2"/>
+        <w:spacing w:before="240" w:after="100"/>
+      </w:pPr>
+      <w:r>
+        <w:t>Decimal support</w:t>
+      </w:r>
+    </w:p>
+    <w:p>
+      <w:pPr>
+        <w:spacing w:after="120"/>
+      </w:pPr>
+      <w:r>
+        <w:rPr>
+          <w:b w:val="0"/>
+        </w:rPr>
+        <w:t>The decimal key appends one point only when the display has none, and decimal values work across all four operations. Automated tests cover decimal addition, subtraction, multiplication, and division.</w:t>
+      </w:r>
+    </w:p>
+    <w:p>
+      <w:pPr>
+        <w:pStyle w:val="Heading2"/>
+        <w:spacing w:before="240" w:after="100"/>
+      </w:pPr>
+      <w:r>
+        <w:t>Calculation history</w:t>
+      </w:r>
+    </w:p>
+    <w:p>
+      <w:pPr>
+        <w:spacing w:after="120"/>
+      </w:pPr>
+      <w:r>
+        <w:rPr>
+          <w:b w:val="0"/>
+        </w:rPr>
+        <w:t>Each completed operation is stored as a Calculation record. A scrollable list displays its expression and result, tapping an entry reuses the result, and the app bar clears history.</w:t>
+      </w:r>
+    </w:p>
+    <w:p>
+      <w:pPr>
+        <w:pStyle w:val="Heading2"/>
+        <w:spacing w:before="240" w:after="100"/>
+      </w:pPr>
+      <w:r>
+        <w:t>Multiple operations</w:t>
+      </w:r>
+    </w:p>
+    <w:p>
+      <w:pPr>
+        <w:spacing w:after="120"/>
+      </w:pPr>
+      <w:r>
+        <w:rPr>
+          <w:b w:val="0"/>
+        </w:rPr>
+        <w:t>When another operator is selected, the pending operation is completed before the new operator is stored. The status line announces the running total. For example, 8 + 2 × 3 produces 30 using left-to-right evaluation.</w:t>
+      </w:r>
+    </w:p>
+    <w:p>
+      <w:pPr>
+        <w:pStyle w:val="Heading2"/>
+        <w:spacing w:before="240" w:after="100"/>
+      </w:pPr>
+      <w:r>
+        <w:t>Advanced error handling</w:t>
+      </w:r>
+    </w:p>
+    <w:p>
+      <w:pPr>
+        <w:spacing w:after="120"/>
+      </w:pPr>
+      <w:r>
+        <w:rPr>
+          <w:b w:val="0"/>
+        </w:rPr>
+        <w:t>The app gives recoverable messages for incomplete expressions, division by zero, and non-finite or excessively large results. AC restores a known-good state, and the automated tests reject division by zero.</w:t>
+      </w:r>
+    </w:p>
     <w:p>
       <w:pPr>
         <w:pStyle w:val="Heading1"/>
@@ -629,7 +373,7 @@
         <w:spacing w:before="240" w:after="100"/>
       </w:pPr>
       <w:r>
-        <w:t>AI Agent Test Drive Comparison</w:t>
+        <w:t>Required Agent Test Drive Comparison</w:t>
       </w:r>
     </w:p>
     <w:p>
@@ -640,7 +384,7 @@
         <w:rPr>
           <w:b w:val="0"/>
         </w:rPr>
-        <w:t>I sent the two unchanged course prompts to OpenAI Codex and Google Gemini on October 7, 2026. I compared their advice against the implemented calculator and the automated test suite. Gemini is identified as a second agent; its response is reported as advice, not as proof that the implementation works.</w:t>
+        <w:t>The following course-required comparison records two unchanged prompts sent to OpenAI Codex and Google Gemini on October 7, 2026. The recommendations were checked against the implemented calculator and automated test suite.</w:t>
       </w:r>
     </w:p>
     <w:p>
@@ -741,342 +485,74 @@
         <w:t>Testing Record</w:t>
       </w:r>
     </w:p>
-    <w:tbl>
-      <w:tblPr>
-        <w:tblStyle w:val="TableGrid"/>
-        <w:tblW w:type="auto" w:w="0"/>
-        <w:tblLook w:firstColumn="1" w:firstRow="1" w:lastColumn="0" w:lastRow="0" w:noHBand="0" w:noVBand="1" w:val="04A0"/>
-      </w:tblPr>
-      <w:tblGrid>
-        <w:gridCol w:w="3312"/>
-        <w:gridCol w:w="3312"/>
-        <w:gridCol w:w="3312"/>
-      </w:tblGrid>
-      <w:tr>
-        <w:tc>
-          <w:tcPr>
-            <w:tcW w:type="dxa" w:w="3312"/>
-            <w:shd w:fill="1F4E78"/>
-            <w:tcMar>
-              <w:top w:w="100" w:type="dxa"/>
-              <w:start w:w="120" w:type="dxa"/>
-              <w:bottom w:w="100" w:type="dxa"/>
-              <w:end w:w="120" w:type="dxa"/>
-            </w:tcMar>
-          </w:tcPr>
-          <w:p>
-            <w:r>
-              <w:rPr>
-                <w:b/>
-                <w:color w:val="FFFFFF"/>
-              </w:rPr>
-              <w:t>Check</w:t>
-            </w:r>
-          </w:p>
-        </w:tc>
-        <w:tc>
-          <w:tcPr>
-            <w:tcW w:type="dxa" w:w="3312"/>
-            <w:shd w:fill="1F4E78"/>
-            <w:tcMar>
-              <w:top w:w="100" w:type="dxa"/>
-              <w:start w:w="120" w:type="dxa"/>
-              <w:bottom w:w="100" w:type="dxa"/>
-              <w:end w:w="120" w:type="dxa"/>
-            </w:tcMar>
-          </w:tcPr>
-          <w:p>
-            <w:r>
-              <w:rPr>
-                <w:b/>
-                <w:color w:val="FFFFFF"/>
-              </w:rPr>
-              <w:t>Expected result</w:t>
-            </w:r>
-          </w:p>
-        </w:tc>
-        <w:tc>
-          <w:tcPr>
-            <w:tcW w:type="dxa" w:w="3312"/>
-            <w:shd w:fill="1F4E78"/>
-            <w:tcMar>
-              <w:top w:w="100" w:type="dxa"/>
-              <w:start w:w="120" w:type="dxa"/>
-              <w:bottom w:w="100" w:type="dxa"/>
-              <w:end w:w="120" w:type="dxa"/>
-            </w:tcMar>
-          </w:tcPr>
-          <w:p>
-            <w:r>
-              <w:rPr>
-                <w:b/>
-                <w:color w:val="FFFFFF"/>
-              </w:rPr>
-              <w:t>Status</w:t>
-            </w:r>
-          </w:p>
-        </w:tc>
-      </w:tr>
-      <w:tr>
-        <w:tc>
-          <w:tcPr>
-            <w:tcW w:type="dxa" w:w="3312"/>
-            <w:tcMar>
-              <w:top w:w="100" w:type="dxa"/>
-              <w:start w:w="120" w:type="dxa"/>
-              <w:bottom w:w="100" w:type="dxa"/>
-              <w:end w:w="120" w:type="dxa"/>
-            </w:tcMar>
-          </w:tcPr>
-          <w:p>
-            <w:r>
-              <w:t>flutter analyze</w:t>
-            </w:r>
-          </w:p>
-        </w:tc>
-        <w:tc>
-          <w:tcPr>
-            <w:tcW w:type="dxa" w:w="3312"/>
-            <w:tcMar>
-              <w:top w:w="100" w:type="dxa"/>
-              <w:start w:w="120" w:type="dxa"/>
-              <w:bottom w:w="100" w:type="dxa"/>
-              <w:end w:w="120" w:type="dxa"/>
-            </w:tcMar>
-          </w:tcPr>
-          <w:p>
-            <w:r>
-              <w:t>No static-analysis issues</w:t>
-            </w:r>
-          </w:p>
-        </w:tc>
-        <w:tc>
-          <w:tcPr>
-            <w:tcW w:type="dxa" w:w="3312"/>
-            <w:tcMar>
-              <w:top w:w="100" w:type="dxa"/>
-              <w:start w:w="120" w:type="dxa"/>
-              <w:bottom w:w="100" w:type="dxa"/>
-              <w:end w:w="120" w:type="dxa"/>
-            </w:tcMar>
-          </w:tcPr>
-          <w:p>
-            <w:r>
-              <w:t>Completed</w:t>
-            </w:r>
-          </w:p>
-        </w:tc>
-      </w:tr>
-      <w:tr>
-        <w:tc>
-          <w:tcPr>
-            <w:tcW w:type="dxa" w:w="3312"/>
-            <w:tcMar>
-              <w:top w:w="100" w:type="dxa"/>
-              <w:start w:w="120" w:type="dxa"/>
-              <w:bottom w:w="100" w:type="dxa"/>
-              <w:end w:w="120" w:type="dxa"/>
-            </w:tcMar>
-          </w:tcPr>
-          <w:p>
-            <w:r>
-              <w:t>flutter test</w:t>
-            </w:r>
-          </w:p>
-        </w:tc>
-        <w:tc>
-          <w:tcPr>
-            <w:tcW w:type="dxa" w:w="3312"/>
-            <w:tcMar>
-              <w:top w:w="100" w:type="dxa"/>
-              <w:start w:w="120" w:type="dxa"/>
-              <w:bottom w:w="100" w:type="dxa"/>
-              <w:end w:w="120" w:type="dxa"/>
-            </w:tcMar>
-          </w:tcPr>
-          <w:p>
-            <w:r>
-              <w:t>Three tests pass, including all four decimal operations and division by zero</w:t>
-            </w:r>
-          </w:p>
-        </w:tc>
-        <w:tc>
-          <w:tcPr>
-            <w:tcW w:type="dxa" w:w="3312"/>
-            <w:tcMar>
-              <w:top w:w="100" w:type="dxa"/>
-              <w:start w:w="120" w:type="dxa"/>
-              <w:bottom w:w="100" w:type="dxa"/>
-              <w:end w:w="120" w:type="dxa"/>
-            </w:tcMar>
-          </w:tcPr>
-          <w:p>
-            <w:r>
-              <w:t>Completed</w:t>
-            </w:r>
-          </w:p>
-        </w:tc>
-      </w:tr>
-      <w:tr>
-        <w:tc>
-          <w:tcPr>
-            <w:tcW w:type="dxa" w:w="3312"/>
-            <w:tcMar>
-              <w:top w:w="100" w:type="dxa"/>
-              <w:start w:w="120" w:type="dxa"/>
-              <w:bottom w:w="100" w:type="dxa"/>
-              <w:end w:w="120" w:type="dxa"/>
-            </w:tcMar>
-          </w:tcPr>
-          <w:p>
-            <w:r>
-              <w:t>flutter build apk --release</w:t>
-            </w:r>
-          </w:p>
-        </w:tc>
-        <w:tc>
-          <w:tcPr>
-            <w:tcW w:type="dxa" w:w="3312"/>
-            <w:tcMar>
-              <w:top w:w="100" w:type="dxa"/>
-              <w:start w:w="120" w:type="dxa"/>
-              <w:bottom w:w="100" w:type="dxa"/>
-              <w:end w:w="120" w:type="dxa"/>
-            </w:tcMar>
-          </w:tcPr>
-          <w:p>
-            <w:r>
-              <w:t>Release APK generated</w:t>
-            </w:r>
-          </w:p>
-        </w:tc>
-        <w:tc>
-          <w:tcPr>
-            <w:tcW w:type="dxa" w:w="3312"/>
-            <w:tcMar>
-              <w:top w:w="100" w:type="dxa"/>
-              <w:start w:w="120" w:type="dxa"/>
-              <w:bottom w:w="100" w:type="dxa"/>
-              <w:end w:w="120" w:type="dxa"/>
-            </w:tcMar>
-          </w:tcPr>
-          <w:p>
-            <w:r>
-              <w:t>Completed</w:t>
-            </w:r>
-          </w:p>
-        </w:tc>
-      </w:tr>
-      <w:tr>
-        <w:tc>
-          <w:tcPr>
-            <w:tcW w:type="dxa" w:w="3312"/>
-            <w:tcMar>
-              <w:top w:w="100" w:type="dxa"/>
-              <w:start w:w="120" w:type="dxa"/>
-              <w:bottom w:w="100" w:type="dxa"/>
-              <w:end w:w="120" w:type="dxa"/>
-            </w:tcMar>
-          </w:tcPr>
-          <w:p>
-            <w:r>
-              <w:t>Android device or emulator installation</w:t>
-            </w:r>
-          </w:p>
-        </w:tc>
-        <w:tc>
-          <w:tcPr>
-            <w:tcW w:type="dxa" w:w="3312"/>
-            <w:tcMar>
-              <w:top w:w="100" w:type="dxa"/>
-              <w:start w:w="120" w:type="dxa"/>
-              <w:bottom w:w="100" w:type="dxa"/>
-              <w:end w:w="120" w:type="dxa"/>
-            </w:tcMar>
-          </w:tcPr>
-          <w:p>
-            <w:r>
-              <w:t>Install and exercise the release APK before upload</w:t>
-            </w:r>
-          </w:p>
-        </w:tc>
-        <w:tc>
-          <w:tcPr>
-            <w:tcW w:type="dxa" w:w="3312"/>
-            <w:tcMar>
-              <w:top w:w="100" w:type="dxa"/>
-              <w:start w:w="120" w:type="dxa"/>
-              <w:bottom w:w="100" w:type="dxa"/>
-              <w:end w:w="120" w:type="dxa"/>
-            </w:tcMar>
-          </w:tcPr>
-          <w:p>
-            <w:r>
-              <w:t>Student action required</w:t>
-            </w:r>
-          </w:p>
-        </w:tc>
-      </w:tr>
-      <w:tr>
-        <w:tc>
-          <w:tcPr>
-            <w:tcW w:type="dxa" w:w="3312"/>
-            <w:tcMar>
-              <w:top w:w="100" w:type="dxa"/>
-              <w:start w:w="120" w:type="dxa"/>
-              <w:bottom w:w="100" w:type="dxa"/>
-              <w:end w:w="120" w:type="dxa"/>
-            </w:tcMar>
-          </w:tcPr>
-          <w:p>
-            <w:r>
-              <w:t>Repository visibility</w:t>
-            </w:r>
-          </w:p>
-        </w:tc>
-        <w:tc>
-          <w:tcPr>
-            <w:tcW w:type="dxa" w:w="3312"/>
-            <w:tcMar>
-              <w:top w:w="100" w:type="dxa"/>
-              <w:start w:w="120" w:type="dxa"/>
-              <w:bottom w:w="100" w:type="dxa"/>
-              <w:end w:w="120" w:type="dxa"/>
-            </w:tcMar>
-          </w:tcPr>
-          <w:p>
-            <w:r>
-              <w:t>Instructor can access complete source and README</w:t>
-            </w:r>
-          </w:p>
-        </w:tc>
-        <w:tc>
-          <w:tcPr>
-            <w:tcW w:type="dxa" w:w="3312"/>
-            <w:tcMar>
-              <w:top w:w="100" w:type="dxa"/>
-              <w:start w:w="120" w:type="dxa"/>
-              <w:bottom w:w="100" w:type="dxa"/>
-              <w:end w:w="120" w:type="dxa"/>
-            </w:tcMar>
-          </w:tcPr>
-          <w:p>
-            <w:r>
-              <w:t>Student action required</w:t>
-            </w:r>
-          </w:p>
-        </w:tc>
-      </w:tr>
-    </w:tbl>
     <w:p>
       <w:pPr>
-        <w:spacing w:after="120"/>
+        <w:pStyle w:val="ListBullet"/>
       </w:pPr>
       <w:r>
         <w:rPr>
           <w:b/>
         </w:rPr>
-        <w:t>AI-use disclosure: I used OpenAI Codex for implementation assistance and test planning and Google Gemini for the required independent-agent comparison. I reviewed the suggestions and verified implementation claims using flutter analyze, flutter test, a release build, and source-code inspection.</w:t>
+        <w:t xml:space="preserve">flutter analyze: </w:t>
+      </w:r>
+      <w:r>
+        <w:t>Completed with no static-analysis issues.</w:t>
+      </w:r>
+    </w:p>
+    <w:p>
+      <w:pPr>
+        <w:pStyle w:val="ListBullet"/>
+      </w:pPr>
+      <w:r>
+        <w:rPr>
+          <w:b/>
+        </w:rPr>
+        <w:t xml:space="preserve">flutter test: </w:t>
+      </w:r>
+      <w:r>
+        <w:t>Completed with three passing tests, including all four decimal operations and division by zero.</w:t>
+      </w:r>
+    </w:p>
+    <w:p>
+      <w:pPr>
+        <w:pStyle w:val="ListBullet"/>
+      </w:pPr>
+      <w:r>
+        <w:rPr>
+          <w:b/>
+        </w:rPr>
+        <w:t xml:space="preserve">flutter build apk --release: </w:t>
+      </w:r>
+      <w:r>
+        <w:t>Completed; the release APK was generated.</w:t>
+      </w:r>
+    </w:p>
+    <w:p>
+      <w:pPr>
+        <w:pStyle w:val="ListBullet"/>
+      </w:pPr>
+      <w:r>
+        <w:rPr>
+          <w:b/>
+        </w:rPr>
+        <w:t xml:space="preserve">Android device or emulator installation: </w:t>
+      </w:r>
+      <w:r>
+        <w:t>Install and exercise the release APK before upload.</w:t>
+      </w:r>
+    </w:p>
+    <w:p>
+      <w:pPr>
+        <w:pStyle w:val="ListBullet"/>
+      </w:pPr>
+      <w:r>
+        <w:rPr>
+          <w:b/>
+        </w:rPr>
+        <w:t xml:space="preserve">Repository visibility: </w:t>
+      </w:r>
+      <w:r>
+        <w:t>The instructor can access the complete source and README at the repository URL above.</w:t>
       </w:r>
     </w:p>
     <w:sectPr>

</xml_diff>